<commit_message>
working on RF comments
</commit_message>
<xml_diff>
--- a/Figs/Supplement/pca_table.docx
+++ b/Figs/Supplement/pca_table.docx
@@ -110,7 +110,7 @@
                 <w:rFonts w:ascii="Calibri" w:hAnsi="Calibri"/>
                 <w:sz w:val="20"/>
               </w:rPr>
-              <w:t xml:space="default">PC1 (λ = 4.26, 71.0%)</w:t>
+              <w:t xml:space="default">PC1 (λ = 3.32, 66.5%)</w:t>
             </w:r>
           </w:p>
         </w:tc>
@@ -132,7 +132,7 @@
                 <w:rFonts w:ascii="Calibri" w:hAnsi="Calibri"/>
                 <w:sz w:val="20"/>
               </w:rPr>
-              <w:t xml:space="default">PC2 (λ = 1.03, 17.1%)</w:t>
+              <w:t xml:space="default">PC2 (λ = 1.00, 20.1%)</w:t>
             </w:r>
           </w:p>
         </w:tc>
@@ -155,7 +155,7 @@
                 <w:rFonts w:ascii="Calibri" w:hAnsi="Calibri"/>
                 <w:sz w:val="20"/>
               </w:rPr>
-              <w:t xml:space="default">PC3 (λ = 0.51, 8.5%)</w:t>
+              <w:t xml:space="default">PC3 (λ = 0.50, 9.9%)</w:t>
             </w:r>
           </w:p>
         </w:tc>
@@ -184,7 +184,7 @@
                 <w:rFonts w:ascii="Calibri" w:hAnsi="Calibri"/>
                 <w:sz w:val="20"/>
               </w:rPr>
-              <w:t xml:space="default">Mean</w:t>
+              <w:t xml:space="default">Amplitude</w:t>
             </w:r>
           </w:p>
         </w:tc>
@@ -208,7 +208,7 @@
                 <w:rFonts w:ascii="Calibri" w:hAnsi="Calibri"/>
                 <w:sz w:val="20"/>
               </w:rPr>
-              <w:t xml:space="default">2.94</w:t>
+              <w:t xml:space="default">-1.73</w:t>
             </w:r>
           </w:p>
         </w:tc>
@@ -232,7 +232,7 @@
                 <w:rFonts w:ascii="Calibri" w:hAnsi="Calibri"/>
                 <w:sz w:val="20"/>
               </w:rPr>
-              <w:t xml:space="default">0.80</w:t>
+              <w:t xml:space="default">4.72</w:t>
             </w:r>
           </w:p>
         </w:tc>
@@ -256,7 +256,7 @@
                 <w:rFonts w:ascii="Calibri" w:hAnsi="Calibri"/>
                 <w:sz w:val="20"/>
               </w:rPr>
-              <w:t xml:space="default">0.81</w:t>
+              <w:t xml:space="default">0.79</w:t>
             </w:r>
           </w:p>
         </w:tc>
@@ -285,7 +285,7 @@
                 <w:rFonts w:ascii="Calibri" w:hAnsi="Calibri"/>
                 <w:sz w:val="20"/>
               </w:rPr>
-              <w:t xml:space="default">Amplitude</w:t>
+              <w:t xml:space="default">Exceedence Probability</w:t>
             </w:r>
           </w:p>
         </w:tc>
@@ -309,7 +309,7 @@
                 <w:rFonts w:ascii="Calibri" w:hAnsi="Calibri"/>
                 <w:sz w:val="20"/>
               </w:rPr>
-              <w:t xml:space="default">-1.54</w:t>
+              <w:t xml:space="default">-2.47</w:t>
             </w:r>
           </w:p>
         </w:tc>
@@ -333,7 +333,7 @@
                 <w:rFonts w:ascii="Calibri" w:hAnsi="Calibri"/>
                 <w:sz w:val="20"/>
               </w:rPr>
-              <w:t xml:space="default">5.23</w:t>
+              <w:t xml:space="default">0.10</w:t>
             </w:r>
           </w:p>
         </w:tc>
@@ -357,7 +357,7 @@
                 <w:rFonts w:ascii="Calibri" w:hAnsi="Calibri"/>
                 <w:sz w:val="20"/>
               </w:rPr>
-              <w:t xml:space="default">-0.94</w:t>
+              <w:t xml:space="default">-4.95</w:t>
             </w:r>
           </w:p>
         </w:tc>
@@ -386,7 +386,7 @@
                 <w:rFonts w:ascii="Calibri" w:hAnsi="Calibri"/>
                 <w:sz w:val="20"/>
               </w:rPr>
-              <w:t xml:space="default">Exceedence Probability</w:t>
+              <w:t xml:space="default">Probability of Hypoxia</w:t>
             </w:r>
           </w:p>
         </w:tc>
@@ -410,7 +410,7 @@
                 <w:rFonts w:ascii="Calibri" w:hAnsi="Calibri"/>
                 <w:sz w:val="20"/>
               </w:rPr>
-              <w:t xml:space="default">-2.29</w:t>
+              <w:t xml:space="default">-2.76</w:t>
             </w:r>
           </w:p>
         </w:tc>
@@ -434,7 +434,7 @@
                 <w:rFonts w:ascii="Calibri" w:hAnsi="Calibri"/>
                 <w:sz w:val="20"/>
               </w:rPr>
-              <w:t xml:space="default">0.49</w:t>
+              <w:t xml:space="default">-0.95</w:t>
             </w:r>
           </w:p>
         </w:tc>
@@ -458,7 +458,7 @@
                 <w:rFonts w:ascii="Calibri" w:hAnsi="Calibri"/>
                 <w:sz w:val="20"/>
               </w:rPr>
-              <w:t xml:space="default">5.55</w:t>
+              <w:t xml:space="default">2.61</w:t>
             </w:r>
           </w:p>
         </w:tc>
@@ -487,7 +487,7 @@
                 <w:rFonts w:ascii="Calibri" w:hAnsi="Calibri"/>
                 <w:sz w:val="20"/>
               </w:rPr>
-              <w:t xml:space="default">Probability of Hypoxia</w:t>
+              <w:t xml:space="default">Min</w:t>
             </w:r>
           </w:p>
         </w:tc>
@@ -511,7 +511,7 @@
                 <w:rFonts w:ascii="Calibri" w:hAnsi="Calibri"/>
                 <w:sz w:val="20"/>
               </w:rPr>
-              <w:t xml:space="default">-2.68</w:t>
+              <w:t xml:space="default">3.05</w:t>
             </w:r>
           </w:p>
         </w:tc>
@@ -535,7 +535,7 @@
                 <w:rFonts w:ascii="Calibri" w:hAnsi="Calibri"/>
                 <w:sz w:val="20"/>
               </w:rPr>
-              <w:t xml:space="default">-0.75</w:t>
+              <w:t xml:space="default">-0.66</w:t>
             </w:r>
           </w:p>
         </w:tc>
@@ -559,7 +559,7 @@
                 <w:rFonts w:ascii="Calibri" w:hAnsi="Calibri"/>
                 <w:sz w:val="20"/>
               </w:rPr>
-              <w:t xml:space="default">-2.42</w:t>
+              <w:t xml:space="default">-0.82</w:t>
             </w:r>
           </w:p>
         </w:tc>
@@ -588,7 +588,7 @@
                 <w:rFonts w:ascii="Calibri" w:hAnsi="Calibri"/>
                 <w:sz w:val="20"/>
               </w:rPr>
-              <w:t xml:space="default">Min</w:t>
+              <w:t xml:space="default">Max</w:t>
             </w:r>
           </w:p>
         </w:tc>
@@ -612,7 +612,7 @@
                 <w:rFonts w:ascii="Calibri" w:hAnsi="Calibri"/>
                 <w:sz w:val="20"/>
               </w:rPr>
-              <w:t xml:space="default">2.93</w:t>
+              <w:t xml:space="default">2.59</w:t>
             </w:r>
           </w:p>
         </w:tc>
@@ -636,7 +636,7 @@
                 <w:rFonts w:ascii="Calibri" w:hAnsi="Calibri"/>
                 <w:sz w:val="20"/>
               </w:rPr>
-              <w:t xml:space="default">-0.99</w:t>
+              <w:t xml:space="default">3.02</w:t>
             </w:r>
           </w:p>
         </w:tc>
@@ -660,108 +660,7 @@
                 <w:rFonts w:ascii="Calibri" w:hAnsi="Calibri"/>
                 <w:sz w:val="20"/>
               </w:rPr>
-              <w:t xml:space="default">0.70</w:t>
-            </w:r>
-          </w:p>
-        </w:tc>
-      </w:tr>
-      <w:tr>
-        <w:trPr>
-          <w:cantSplit/>
-        </w:trPr>
-        <w:tc>
-          <w:tcPr>
-            <w:tcBorders>
-              <w:top w:val="single" w:space="0" w:color="D3D3D3"/>
-              <w:bottom w:val="single" w:space="0" w:color="D3D3D3"/>
-              <w:start w:val="single" w:space="0" w:color="D3D3D3"/>
-              <w:end w:val="single" w:space="0" w:color="D3D3D3"/>
-            </w:tcBorders>
-          </w:tcPr>
-          <w:p>
-            <w:pPr>
-              <w:spacing w:before="0" w:after="60"/>
-              <w:keepNext/>
-              <w:jc w:val="center"/>
-            </w:pPr>
-            <w:r>
-              <w:rPr>
-                <w:rFonts w:ascii="Calibri" w:hAnsi="Calibri"/>
-                <w:sz w:val="20"/>
-              </w:rPr>
-              <w:t xml:space="default">Max</w:t>
-            </w:r>
-          </w:p>
-        </w:tc>
-        <w:tc>
-          <w:tcPr>
-            <w:tcBorders>
-              <w:top w:val="single" w:space="0" w:color="D3D3D3"/>
-              <w:bottom w:val="single" w:space="0" w:color="D3D3D3"/>
-              <w:start w:val="single" w:space="0" w:color="D3D3D3"/>
-              <w:end w:val="single" w:space="0" w:color="D3D3D3"/>
-            </w:tcBorders>
-          </w:tcPr>
-          <w:p>
-            <w:pPr>
-              <w:spacing w:before="0" w:after="60"/>
-              <w:keepNext/>
-              <w:jc w:val="center"/>
-            </w:pPr>
-            <w:r>
-              <w:rPr>
-                <w:rFonts w:ascii="Calibri" w:hAnsi="Calibri"/>
-                <w:sz w:val="20"/>
-              </w:rPr>
-              <w:t xml:space="default">2.58</w:t>
-            </w:r>
-          </w:p>
-        </w:tc>
-        <w:tc>
-          <w:tcPr>
-            <w:tcBorders>
-              <w:top w:val="single" w:space="0" w:color="D3D3D3"/>
-              <w:bottom w:val="single" w:space="0" w:color="D3D3D3"/>
-              <w:start w:val="single" w:space="0" w:color="D3D3D3"/>
-              <w:end w:val="single" w:space="0" w:color="D3D3D3"/>
-            </w:tcBorders>
-          </w:tcPr>
-          <w:p>
-            <w:pPr>
-              <w:spacing w:before="0" w:after="60"/>
-              <w:keepNext/>
-              <w:jc w:val="center"/>
-            </w:pPr>
-            <w:r>
-              <w:rPr>
-                <w:rFonts w:ascii="Calibri" w:hAnsi="Calibri"/>
-                <w:sz w:val="20"/>
-              </w:rPr>
-              <w:t xml:space="default">2.99</w:t>
-            </w:r>
-          </w:p>
-        </w:tc>
-        <w:tc>
-          <w:tcPr>
-            <w:tcBorders>
-              <w:top w:val="single" w:space="0" w:color="D3D3D3"/>
-              <w:bottom w:val="single" w:space="0" w:color="D3D3D3"/>
-              <w:start w:val="single" w:space="0" w:color="D3D3D3"/>
-              <w:end w:val="single" w:space="0" w:color="D3D3D3"/>
-            </w:tcBorders>
-          </w:tcPr>
-          <w:p>
-            <w:pPr>
-              <w:spacing w:before="0" w:after="60"/>
-              <w:keepNext/>
-              <w:jc w:val="center"/>
-            </w:pPr>
-            <w:r>
-              <w:rPr>
-                <w:rFonts w:ascii="Calibri" w:hAnsi="Calibri"/>
-                <w:sz w:val="20"/>
-              </w:rPr>
-              <w:t xml:space="default">0.14</w:t>
+              <w:t xml:space="default">-0.43</w:t>
             </w:r>
           </w:p>
         </w:tc>
@@ -893,10 +792,10 @@
   <w:docDefaults>
     <w:rPrDefault>
       <w:rPr>
-        <w:rFonts w:asciiTheme="minorHAnsi" w:cstheme="minorBidi" w:eastAsiaTheme="minorHAnsi" w:hAnsiTheme="minorHAnsi"/>
+        <w:rFonts w:asciiTheme="minorHAnsi" w:cstheme="minorBidi" w:eastAsiaTheme="minorEastAsia" w:hAnsiTheme="minorHAnsi"/>
         <w:sz w:val="24"/>
         <w:szCs w:val="24"/>
-        <w:lang w:bidi="ar-SA" w:eastAsia="en-US" w:val="en-US"/>
+        <w:lang w:bidi="ar-SA" w:eastAsia="zh-CN" w:val="en-US"/>
       </w:rPr>
     </w:rPrDefault>
     <w:pPrDefault>
@@ -1437,13 +1336,6 @@
       </w:tblCellMar>
     </w:tblPr>
     <w:tblStylePr w:type="firstRow">
-      <w:tblPr>
-        <w:jc w:val="left"/>
-        <w:tblInd w:type="dxa" w:w="0"/>
-      </w:tblPr>
-      <w:trPr>
-        <w:jc w:val="left"/>
-      </w:trPr>
       <w:tcPr>
         <w:tcBorders>
           <w:bottom w:val="single"/>

</xml_diff>